<commit_message>
Ch 29: swap modern 'minutes' for a Roman idiom
Co-Authored-By: Claude Opus 5.5 (1M context) <noreply@anthropic.com>
Claude-Session: https://claude.ai/code/session_016J1A9VbrbaLp4Q5XYAjW4F
</commit_message>
<xml_diff>
--- a/exports/Ides_Book1_Review.docx
+++ b/exports/Ides_Book1_Review.docx
@@ -27,7 +27,7 @@
         <w:br/>
         <w:t>Book 1 reading export · Utica prologue, then Ch 1 dinner · ends at Philippi · author-voice (no em dash)</w:t>
         <w:br/>
-        <w:t>Source: Manuscript 97c24f5 (2026-10-24) · generated 2026-10-24 02:35 UTC from claude/project-thread-v93zm0 @ 97c24f5 · source digest f3c2511b917571e1 · prologue and chapters 1–34</w:t>
+        <w:t>Source: Manuscript 1ae5ec8 (2026-10-24) · generated 2026-10-24 06:54 UTC from claude/project-thread-f0m6lx @ 1ae5ec8 · source digest 4d53fbf63d06311b · prologue and chapters 1–34</w:t>
       </w:r>
     </w:p>
     <w:p>
@@ -13331,7 +13331,7 @@
     <w:p>
       <w:r>
         <w:rPr/>
-        <w:t xml:space="preserve">The vacuum arrived as named pressure, not triumph. Both consuls were dead, Hirtius in the ditch at Mutina and Pansa of his wound a day after, and their chairs stood empty. A centurion from the Martians said it first, loud enough for the pay line: “They want us under the man who held Caesar’s door. Who feeds us now, old men with tablets, or Caesar’s name?” A tribune seconded without looking at Octavian’s face: the men would not march for an assassin on praise that arrived late and sweet. Agrippa translated the noise into one sentence Octavian could keep. The ranks wanted a consul who was </w:t>
+        <w:t xml:space="preserve">Both consuls were dead, Hirtius in the ditch at Mutina and Pansa of his wound a day after, and their chairs stood empty. A centurion from the Martians said it first, loud enough for the pay line: “They want us under the man who held Caesar’s door. Who feeds us now, old men with tablets, or Caesar’s name?” A tribune seconded without looking at Octavian’s face: the men would not march for an assassin on praise that arrived late and sweet. Agrippa translated the noise into one sentence Octavian could keep. The ranks wanted a consul who was </w:t>
       </w:r>
       <w:r>
         <w:rPr>
@@ -13347,7 +13347,43 @@
     <w:p>
       <w:r>
         <w:rPr/>
-        <w:t xml:space="preserve">Senate pressure arrived in a different mouth. A senior voice, careful with consonants, told Octavian that with both consuls dead the House had no one in the chairs to point at and call the year settled. Decimus was a Liberator with a triumph and a thinning army, not a consul. Antony was over the Alps with Lepidus’s legions. They needed a miracle that obeyed. They needed it before Antony’s friends finished renaming the map. The same voice reminded him, as if reminding were a kindness, that the law asked forty-two years for a consul’s chair and he had nineteen. Octavian had already sent centurions to the Curia with the ranks’ request in writing. One came back and told the pay line what he had said on the steps when the fathers talked about age. He had put his hand on his sword. </w:t>
+        <w:t xml:space="preserve">Philippus wrote from Rome in the stepfather’s hand Octavian had learned to read sideways, every warning folded inside a piece of news. The House was frightened and could not say of what. Decimus was a Liberator with a triumph and a thinning army, not a consul. Antony was over the Alps with Lepidus’s legions. Some of the fathers wanted a consul who obeyed and would settle for one who was young. And then, as if he were only reminding a boy of his lessons: the law wanted forty-two years for the chair. </w:t>
+      </w:r>
+      <w:r>
+        <w:rPr>
+          <w:i/>
+        </w:rPr>
+        <w:t>You have nineteen. Count them before anyone else does.</w:t>
+      </w:r>
+    </w:p>
+    <w:p>
+      <w:r>
+        <w:rPr/>
+        <w:t>Octavian counted them. Then he sent the centurions.</w:t>
+      </w:r>
+    </w:p>
+    <w:p>
+      <w:r>
+        <w:rPr/>
+        <w:t>There were four hundred of them in the end, centurions and picked men from every legion, because the ranks would not trust a smaller number to come back with the truth. They went down to Rome in July with the soldiers’ asks in writing: the money the Senate had voted them and not paid, and a consulship for the man who paid. Octavian did not go. Agrippa did not go. Octavian walked the camp in the days they were away and was polite to everyone and slept badly, and on the eighth night he was sick behind the horse lines and told no one.</w:t>
+      </w:r>
+    </w:p>
+    <w:p>
+      <w:r>
+        <w:rPr/>
+        <w:t>They came back angry. The fathers had kept them standing in the porch, and then had them in, and then talked to them as if they were a deputation of farmers about a road. A senator had asked whose idea the consulship was. Another had said, kindly, that the law wanted forty-two years.</w:t>
+      </w:r>
+    </w:p>
+    <w:p>
+      <w:r>
+        <w:rPr/>
+        <w:t>A centurion called Cornelius told it at the pay line. He was a broad, slow man with a scar through one eyebrow, and he told it the way he must have done it, without hurry. He took his cloak by the shoulder and threw it back, so the men could see the sword at his hip.</w:t>
+      </w:r>
+    </w:p>
+    <w:p>
+      <w:r>
+        <w:rPr/>
+        <w:t xml:space="preserve">“And I said to them, in the House, </w:t>
       </w:r>
       <w:r>
         <w:rPr>
@@ -13357,13 +13393,261 @@
       </w:r>
       <w:r>
         <w:rPr/>
-        <w:t xml:space="preserve"> Octavian offered them a nineteen-year-old with Caesar’s name and enough armed insistence to make elections look like a toll you paid at the gate. Not because destiny asked. Because two empty chairs had shortened every polite road.</w:t>
-      </w:r>
-    </w:p>
-    <w:p>
-      <w:r>
-        <w:rPr/>
-        <w:t xml:space="preserve">He felt sick after the first hard bargain, stomach, not omen. A taste of metal rose; he swallowed it and kept his fingers on the chest lid until the shake stopped. Publicly he accepted the fasces like owed homework. Twelve lictors shouldered the bound rods and walked ahead of him, and men stepped out of the street for the rods before they looked to see whose face came behind. A herald stumbled over </w:t>
+        <w:t>”</w:t>
+      </w:r>
+    </w:p>
+    <w:p>
+      <w:r>
+        <w:rPr/>
+        <w:t>The pay line roared. Octavian, at the chest, kept his face still and his fingers on the lid. He had not told Cornelius to say it. He had not told him not to.</w:t>
+      </w:r>
+    </w:p>
+    <w:p>
+      <w:r>
+        <w:rPr/>
+        <w:t>“Well,” said Agrippa, under the noise. “That’s the letter answered.”</w:t>
+      </w:r>
+    </w:p>
+    <w:p>
+      <w:r>
+        <w:rPr/>
+        <w:t xml:space="preserve">They crossed the little river at the border of Italy late in July, with the eight legions behind them. Octavian rode ahead with the picked cohorts. The water was low, the colour of weak wine, and the horses did not need to swim. He had expected to feel something at it, because it was the same river, and men in the column were already saying so to each other, </w:t>
+      </w:r>
+      <w:r>
+        <w:rPr>
+          <w:i/>
+        </w:rPr>
+        <w:t>his father’s river</w:t>
+      </w:r>
+      <w:r>
+        <w:rPr/>
+        <w:t>, as if it had been in the will with the gardens. He felt his horse’s shoulder shift under him on the stones. He felt the sun on the back of his neck. On the far side he reined in and let the cohorts go past, and watched the faces, and found that the men felt it for him, and that this was more use.</w:t>
+      </w:r>
+    </w:p>
+    <w:p>
+      <w:r>
+        <w:rPr/>
+        <w:t>The Senate sent envoys to meet him on the road with money. Two days later it sent riders after the envoys to take the money back, because two legions had landed from Africa and the fathers had found their courage again. Octavian heard both pieces of news in one evening, and laughed for the first time in a month, and could not stop until Agrippa put a cup in his hand.</w:t>
+      </w:r>
+    </w:p>
+    <w:p>
+      <w:r>
+        <w:rPr/>
+        <w:t>“They’re counting legions,” Agrippa said. “It’s progress.”</w:t>
+      </w:r>
+    </w:p>
+    <w:p>
+      <w:r>
+        <w:rPr/>
+        <w:t>The two African legions went over to him outside the walls. The urban praetor, Cornutus, who had been given the defence of the city with them, fell on his sword when he heard. Octavian was told this at a well on the Via Flaminia, and stood for a while with the dipper in his hand. He had not known Cornutus. He found he wanted to know what the man had looked like, and did not ask.</w:t>
+      </w:r>
+    </w:p>
+    <w:p>
+      <w:r>
+        <w:rPr/>
+        <w:t>His own cavalry had gone into Rome ahead of him with orders to touch nothing and tell everyone. By the time he came in through the gate there were people on the roofs. Some of them cheered. Most watched, the way people watch weather. A woman at a fountain held her child against her skirts and did not look up at all, and Octavian, who had been composing his face for the cheering, composed it again for her.</w:t>
+      </w:r>
+    </w:p>
+    <w:p>
+      <w:r>
+        <w:rPr/>
+        <w:t>His mother and his sister were in the house of the Vestals.</w:t>
+      </w:r>
+    </w:p>
+    <w:p>
+      <w:r>
+        <w:rPr/>
+        <w:t>Philippus had sent them there in July, when the centurions went down, because the Vestals’ house was the one door in Rome no frightened man would kick in. The Virgins had kept the will there. They kept the flame. And for six weeks they had kept Atia and Octavia, among the girls in white, in two rooms off a courtyard that smelled of laurel smoke.</w:t>
+      </w:r>
+    </w:p>
+    <w:p>
+      <w:r>
+        <w:rPr/>
+        <w:t>They came out to him at the steps. Octavia came first, quickly, with her skirts in her fist, and put her arms round his neck before he had finished dismounting, and he stood with one foot in the stirrup and his sister hanging on him in front of half the Forum and found he did not mind. She was twenty-six and married to a man who had been consul, and she smelled of the laurel smoke too. She said his name. His old name. Nobody had said it in a year.</w:t>
+      </w:r>
+    </w:p>
+    <w:p>
+      <w:r>
+        <w:rPr/>
+        <w:t>Atia came after, slowly. She was thinner. Her hands were empty.</w:t>
+      </w:r>
+    </w:p>
+    <w:p>
+      <w:r>
+        <w:rPr/>
+        <w:t xml:space="preserve">“I kept the box,” she said, when Octavia had let go of him. She meant the jewels, the ones she had set on Philippus’s table the night he sold the Velitrae land, when he had told her </w:t>
+      </w:r>
+      <w:r>
+        <w:rPr>
+          <w:i/>
+        </w:rPr>
+        <w:t>not yet</w:t>
+      </w:r>
+      <w:r>
+        <w:rPr/>
+        <w:t>. “They’re in my room. I thought,” she said, and stopped, and looked past him at the soldiers in the Forum, at the cohorts drawn up on the Sacred Way with their shields uncovered, “I thought you might need them now.”</w:t>
+      </w:r>
+    </w:p>
+    <w:p>
+      <w:r>
+        <w:rPr/>
+        <w:t>“Not now either,” he said.</w:t>
+      </w:r>
+    </w:p>
+    <w:p>
+      <w:r>
+        <w:rPr/>
+        <w:t>She looked at him a long moment. Then her face went blank, as it had gone blank in Philippus’s villa when he said the name aloud, as if she had expected nothing else and wished she had been wrong.</w:t>
+      </w:r>
+    </w:p>
+    <w:p>
+      <w:r>
+        <w:rPr/>
+        <w:t>“You look ill,” she said.</w:t>
+      </w:r>
+    </w:p>
+    <w:p>
+      <w:r>
+        <w:rPr/>
+        <w:t>“I’ve been riding.”</w:t>
+      </w:r>
+    </w:p>
+    <w:p>
+      <w:r>
+        <w:rPr/>
+        <w:t>“You’ve been ill.” She put the back of her hand to his cheek, as she had when he was eight, and he let her, in front of the soldiers. “Eat something,” Atia said. “Before you do anything else today. Before you do anything you can’t take back.”</w:t>
+      </w:r>
+    </w:p>
+    <w:p>
+      <w:r>
+        <w:rPr/>
+        <w:t>He ate. He ate standing up, bread and cheese from a soldier’s pack, on the steps of the Vestals’ house with his mother watching, and it was the first food he had kept down in three days.</w:t>
+      </w:r>
+    </w:p>
+    <w:p>
+      <w:r>
+        <w:rPr/>
+        <w:t>The senators came to meet him in the afternoon. They came in twos and threes, in their bordered togas, and made speeches on the steps about the Republic and the young Caesar’s piety, and Octavian thanked each of them by name, because he had learned all their names in the winter from Cicero’s letters and Agrippa’s lists. Some of them had voted a week before to send the African legions out against him. They did not mention it. He did not mention it either.</w:t>
+      </w:r>
+    </w:p>
+    <w:p>
+      <w:r>
+        <w:rPr/>
+        <w:t>Cicero came last.</w:t>
+      </w:r>
+    </w:p>
+    <w:p>
+      <w:r>
+        <w:rPr/>
+        <w:t>He came late in the day with Tiro behind him, and climbed the steps a little slowly, and made a speech that was better than the others and shorter, and took Octavian’s hand in both of his. He smelled of ink and of the Palatine. Octavian looked at him and heard, as clearly as if Labeo were at his elbow, three verbs in their order.</w:t>
+      </w:r>
+    </w:p>
+    <w:p>
+      <w:r>
+        <w:rPr/>
+        <w:t>“You are the last of my friends to greet me,” he said.</w:t>
+      </w:r>
+    </w:p>
+    <w:p>
+      <w:r>
+        <w:rPr/>
+        <w:t>He said it lightly, the way the old man liked things said. Cicero laughed. Tiro did not. And Octavian, who had meant it as a pleasantry when he began the sentence, found by the end of it that he had meant something else, and could not have said exactly what, and let it stand.</w:t>
+      </w:r>
+    </w:p>
+    <w:p>
+      <w:r>
+        <w:rPr/>
+        <w:t>That night a rumour went round that two of his legions had gone back to the Senate. The fathers met by lamplight in the Curia, and Cicero stood at the door to greet them as they came in, and for an hour the old Republic was alive again in one room. Then the rumour was found to be false. Cicero went home in a closed litter, and did not come to the Field of Mars again.</w:t>
+      </w:r>
+    </w:p>
+    <w:p>
+      <w:r>
+        <w:rPr/>
+        <w:t>Octavian heard about it in the morning, from Agrippa, over the pay tables.</w:t>
+      </w:r>
+    </w:p>
+    <w:p>
+      <w:r>
+        <w:rPr/>
+        <w:t>“He stood at the door,” Agrippa said.</w:t>
+      </w:r>
+    </w:p>
+    <w:p>
+      <w:r>
+        <w:rPr/>
+        <w:t>“Of course he did.” Octavian signed a tablet. “He always does.”</w:t>
+      </w:r>
+    </w:p>
+    <w:p>
+      <w:r>
+        <w:rPr/>
+        <w:t>The treasury was in the Temple of Saturn, under the Capitol, and the keys came to him in a dish.</w:t>
+      </w:r>
+    </w:p>
+    <w:p>
+      <w:r>
+        <w:rPr/>
+        <w:t>He did not touch them. He sent a tribune with a guard and a clerk with tablets, and they brought the chests down the temple steps to the Forum in daylight, where the whole city could watch them, and set them out on trestles in the square. Twenty-five hundred a man: the first payment of what the Senate had voted and not paid. The rest promised. The clerks called the names by century, and the men came up in their order, and took their coin, and signed, or made their mark, and went away. It took two days. Octavian sat behind the tables for most of both, and when a tribune leaned in on the first afternoon to say the fathers had sent to ask when the election would be held, he did not look up.</w:t>
+      </w:r>
+    </w:p>
+    <w:p>
+      <w:r>
+        <w:rPr/>
+        <w:t>“Honours after the line is fed,” he said.</w:t>
+      </w:r>
+    </w:p>
+    <w:p>
+      <w:r>
+        <w:rPr/>
+        <w:t>The line was fed on the second evening. The election was on the nineteenth.</w:t>
+      </w:r>
+    </w:p>
+    <w:p>
+      <w:r>
+        <w:rPr/>
+        <w:t>They held it on the Field of Mars, where the voting pens were, with the legions camped round it close enough to hear. Octavian had wanted Pedius for his colleague, and Pedius was willing. Pedius was his cousin, another grandson of Caesar’s sister, a share of the last quarter of the will to Octavian’s three, an elderly man who had fought in Spain for his uncle and wanted, now, only to be left a quiet old age. He stood next to Octavian in the white toga of a candidate and coughed into his fist. The centuries came up in their order and voted, and the heralds called them, and the count was never in doubt, and everyone knew it, and still they counted, because counting was what made it a law.</w:t>
+      </w:r>
+    </w:p>
+    <w:p>
+      <w:r>
+        <w:rPr/>
+        <w:t>The augur had taken the auspices at dawn. Octavian had stood beside him on the hill in the cold, and watched him mark out the sky with his staff, and they had waited. Birds came over from the river. Vultures, the augur said. Six of them. They went over high and slow and away toward the Janiculum.</w:t>
+      </w:r>
+    </w:p>
+    <w:p>
+      <w:r>
+        <w:rPr/>
+        <w:t>Later, while Octavian was speaking to the soldiers, more came over. The men in the front ranks saw them and pointed, and a noise went back through the legions, and by the time Octavian had finished speaking someone was saying twelve, and someone else was saying that twelve had come to Romulus when he founded the city, and by evening the whole camp was saying it.</w:t>
+      </w:r>
+    </w:p>
+    <w:p>
+      <w:r>
+        <w:rPr/>
+        <w:t>Agrippa had counted. He said six, and then six. He said it was a hot summer and the river at the bottom of the Field had dead things in it.</w:t>
+      </w:r>
+    </w:p>
+    <w:p>
+      <w:r>
+        <w:rPr/>
+        <w:t>“Which is it?” Octavian asked.</w:t>
+      </w:r>
+    </w:p>
+    <w:p>
+      <w:r>
+        <w:rPr/>
+        <w:t>“Both, I should think.” Agrippa looked at the sky, which was empty now. “That’s the art.”</w:t>
+      </w:r>
+    </w:p>
+    <w:p>
+      <w:r>
+        <w:rPr/>
+        <w:t>Octavian looked at the empty sky a moment longer than he meant to.</w:t>
+      </w:r>
+    </w:p>
+    <w:p>
+      <w:r>
+        <w:rPr/>
+        <w:t xml:space="preserve">He felt sick after the count, stomach, not omen. A taste of metal rose; he swallowed it and kept his fingers on the chest lid until the shake stopped. Publicly he accepted the fasces like owed homework. Twelve lictors shouldered the bound rods and walked ahead of him, and men stepped out of the street for the rods before they looked to see whose face came behind. A herald stumbled over </w:t>
       </w:r>
       <w:r>
         <w:rPr>
@@ -13384,6 +13668,12 @@
       <w:r>
         <w:rPr/>
         <w:t xml:space="preserve"> in the same breath, as if the two words had never met. Octavian let him find his way to the end.</w:t>
+      </w:r>
+    </w:p>
+    <w:p>
+      <w:r>
+        <w:rPr/>
+        <w:t>Pedius had his first law ready before the lictors had learned the way to the new consul’s door: a court for the men of the Ides. It sat in a day. Nobody spoke for the absent, because nobody was fool enough to. Octavian read the list of the condemned at supper, and Decimus’s name was on it, and Casca’s, and Brutus’s and Cassius’s at the top, and he put the tablet face down beside his plate and ate what was on the plate, because his mother had told him to.</w:t>
       </w:r>
     </w:p>
     <w:p>

</xml_diff>